<commit_message>
fix: agregar seccion faltante al indice del libro
"Recursos y proximos pasos" (cierre del libro) existia en el cuerpo pero
no estaba listada en el indice. Se agrega.

Co-Authored-By: Claude Sonnet 5 <noreply@anthropic.com>
Claude-Session: https://claude.ai/code/session_01BGajP5s9F1aLgfyztSAp9Y
</commit_message>
<xml_diff>
--- a/docs/libro/Music_Business_Para_Todos_Los_Humanos_IM_Music.docx
+++ b/docs/libro/Music_Business_Para_Todos_Los_Humanos_IM_Music.docx
@@ -985,6 +985,18 @@
           <w:sz w:val="22"/>
         </w:rPr>
         <w:t>Sobre IM Music</w:t>
+      </w:r>
+    </w:p>
+    <w:p>
+      <w:pPr>
+        <w:spacing w:after="160"/>
+      </w:pPr>
+      <w:r>
+        <w:rPr>
+          <w:rFonts w:ascii="Georgia" w:hAnsi="Georgia"/>
+          <w:sz w:val="22"/>
+        </w:rPr>
+        <w:t>📚 Recursos y próximos pasos</w:t>
       </w:r>
     </w:p>
     <w:p>

</xml_diff>